<commit_message>
fix: fixed some typo in the manual
</commit_message>
<xml_diff>
--- a/project_code/docs/project_manual.docx
+++ b/project_code/docs/project_manual.docx
@@ -81,7 +81,17 @@
           <w:kern w:val="0"/>
           <w14:ligatures w14:val="none"/>
         </w:rPr>
-        <w:t>ShopEase E-Commerce System</w:t>
+        <w:t>PharmaEase</w:t>
+      </w:r>
+      <w:r>
+        <w:rPr>
+          <w:rFonts w:asciiTheme="majorBidi" w:eastAsia="Times New Roman" w:hAnsiTheme="majorBidi" w:cstheme="majorBidi"/>
+          <w:b/>
+          <w:bCs/>
+          <w:kern w:val="0"/>
+          <w14:ligatures w14:val="none"/>
+        </w:rPr>
+        <w:t xml:space="preserve"> E-Commerce System</w:t>
       </w:r>
       <w:r>
         <w:rPr>
@@ -988,19 +998,7 @@
         <w:rPr>
           <w:rFonts w:asciiTheme="majorBidi" w:hAnsiTheme="majorBidi"/>
         </w:rPr>
-        <w:t xml:space="preserve">docker-compose up </w:t>
-      </w:r>
-      <w:r>
-        <w:rPr>
-          <w:rFonts w:asciiTheme="majorBidi" w:hAnsiTheme="majorBidi"/>
-        </w:rPr>
-        <w:t xml:space="preserve"> </w:t>
-      </w:r>
-      <w:r>
-        <w:rPr>
-          <w:rFonts w:asciiTheme="majorBidi" w:hAnsiTheme="majorBidi"/>
-        </w:rPr>
-        <w:t>--build</w:t>
+        <w:t>docker-compose up  --build</w:t>
       </w:r>
     </w:p>
     <w:p>
@@ -1468,19 +1466,7 @@
         <w:rPr>
           <w:rFonts w:asciiTheme="majorBidi" w:hAnsiTheme="majorBidi" w:cstheme="majorBidi"/>
         </w:rPr>
-        <w:t>(project_code/models/): Responsible for data structure and business logic. The application uses Python classes (</w:t>
-      </w:r>
-      <w:r>
-        <w:rPr>
-          <w:rFonts w:asciiTheme="majorBidi" w:hAnsiTheme="majorBidi" w:cstheme="majorBidi"/>
-        </w:rPr>
-        <w:t>e.g., ProductModel, UserModel</w:t>
-      </w:r>
-      <w:r>
-        <w:rPr>
-          <w:rFonts w:asciiTheme="majorBidi" w:hAnsiTheme="majorBidi" w:cstheme="majorBidi"/>
-        </w:rPr>
-        <w:t>) to represent entities. These models interact with the repository layer to fetch and save data to the underlying CSV storage.</w:t>
+        <w:t>(project_code/models/): Responsible for data structure and business logic. The application uses Python classes (e.g., ProductModel, UserModel) to represent entities. These models interact with the repository layer to fetch and save data to the underlying CSV storage.</w:t>
       </w:r>
     </w:p>
     <w:p>
@@ -1506,13 +1492,7 @@
         <w:rPr>
           <w:rFonts w:asciiTheme="majorBidi" w:hAnsiTheme="majorBidi" w:cstheme="majorBidi"/>
         </w:rPr>
-        <w:t>(project_code/templates/):</w:t>
-      </w:r>
-      <w:r>
-        <w:rPr>
-          <w:rFonts w:asciiTheme="majorBidi" w:hAnsiTheme="majorBidi" w:cstheme="majorBidi"/>
-        </w:rPr>
-        <w:t xml:space="preserve"> The presentation layer is built using </w:t>
+        <w:t xml:space="preserve">(project_code/templates/): The presentation layer is built using </w:t>
       </w:r>
       <w:r>
         <w:rPr>
@@ -1552,13 +1532,7 @@
         <w:rPr>
           <w:rFonts w:asciiTheme="majorBidi" w:hAnsiTheme="majorBidi" w:cstheme="majorBidi"/>
         </w:rPr>
-        <w:t>(project_code/controllers/):</w:t>
-      </w:r>
-      <w:r>
-        <w:rPr>
-          <w:rFonts w:asciiTheme="majorBidi" w:hAnsiTheme="majorBidi" w:cstheme="majorBidi"/>
-        </w:rPr>
-        <w:t xml:space="preserve"> Implemented using Flask </w:t>
+        <w:t xml:space="preserve">(project_code/controllers/): Implemented using Flask </w:t>
       </w:r>
       <w:r>
         <w:rPr>
@@ -1572,25 +1546,7 @@
         <w:rPr>
           <w:rFonts w:asciiTheme="majorBidi" w:hAnsiTheme="majorBidi" w:cstheme="majorBidi"/>
         </w:rPr>
-        <w:t xml:space="preserve">, controllers handle incoming HTTP requests, process user input, interact with the models, and return the appropriate response (either a rendered HTML page or a JSON response). Key controllers include </w:t>
-      </w:r>
-      <w:r>
-        <w:rPr>
-          <w:rFonts w:asciiTheme="majorBidi" w:hAnsiTheme="majorBidi" w:cstheme="majorBidi"/>
-        </w:rPr>
-        <w:t>user_controller, product_controller, cart_controller</w:t>
-      </w:r>
-      <w:r>
-        <w:rPr>
-          <w:rFonts w:asciiTheme="majorBidi" w:hAnsiTheme="majorBidi" w:cstheme="majorBidi"/>
-        </w:rPr>
-        <w:t xml:space="preserve">, and </w:t>
-      </w:r>
-      <w:r>
-        <w:rPr>
-          <w:rFonts w:asciiTheme="majorBidi" w:hAnsiTheme="majorBidi" w:cstheme="majorBidi"/>
-        </w:rPr>
-        <w:t>order_controller.</w:t>
+        <w:t>, controllers handle incoming HTTP requests, process user input, interact with the models, and return the appropriate response (either a rendered HTML page or a JSON response). Key controllers include user_controller, product_controller, cart_controller, and order_controller.</w:t>
       </w:r>
     </w:p>
     <w:p>
@@ -5700,6 +5656,7 @@
   <w:style w:type="character" w:default="1" w:styleId="DefaultParagraphFont">
     <w:name w:val="Default Paragraph Font"/>
     <w:uiPriority w:val="1"/>
+    <w:semiHidden/>
     <w:unhideWhenUsed/>
   </w:style>
   <w:style w:type="table" w:default="1" w:styleId="TableNormal">

</xml_diff>